<commit_message>
Book 2: record author decisions and add Chapter 1 draft
Co-Authored-By: Claude Opus 5.5 <noreply@anthropic.com>
Claude-Session: https://claude.ai/code/session_01MoWmDNVtH34VN9ywvoYJRo
</commit_message>
<xml_diff>
--- a/book2/Book2_Outline.docx
+++ b/book2/Book2_Outline.docx
@@ -2487,13 +2487,13 @@
     </w:p>
     <w:bookmarkEnd w:id="39"/>
     <w:bookmarkEnd w:id="40"/>
-    <w:bookmarkStart w:id="41" w:name="decisions-for-you"/>
+    <w:bookmarkStart w:id="41" w:name="decisions-from-the-author"/>
     <w:p>
       <w:pPr>
         <w:pStyle w:val="Heading2"/>
       </w:pPr>
       <w:r>
-        <w:t xml:space="preserve">Decisions for you</w:t>
+        <w:t xml:space="preserve">Decisions (from the author)</w:t>
       </w:r>
     </w:p>
     <w:p>
@@ -2515,46 +2515,40 @@
         <w:t xml:space="preserve"> </w:t>
       </w:r>
       <w:r>
-        <w:t xml:space="preserve">should Book 2’s last page preview the Yeshua book? And how should the name be spelled:</w:t>
-      </w:r>
-      <w:r>
-        <w:t xml:space="preserve"> </w:t>
-      </w:r>
-      <w:r>
-        <w:rPr>
-          <w:iCs/>
-          <w:i/>
-        </w:rPr>
+        <w:t xml:space="preserve">yes, Book 2’s last page previews the Yeshua book. Spelling to be confirmed:</w:t>
+      </w:r>
+      <w:r>
+        <w:t xml:space="preserve"> </w:t>
+      </w:r>
+      <w:r>
+        <w:t xml:space="preserve">“</w:t>
+      </w:r>
+      <w:r>
         <w:t xml:space="preserve">Yeshua</w:t>
       </w:r>
       <w:r>
-        <w:t xml:space="preserve">,</w:t>
-      </w:r>
-      <w:r>
-        <w:t xml:space="preserve"> </w:t>
-      </w:r>
-      <w:r>
-        <w:rPr>
-          <w:iCs/>
-          <w:i/>
-        </w:rPr>
-        <w:t xml:space="preserve">Yahshua</w:t>
-      </w:r>
-      <w:r>
-        <w:t xml:space="preserve">, or</w:t>
-      </w:r>
-      <w:r>
-        <w:t xml:space="preserve"> </w:t>
-      </w:r>
-      <w:r>
-        <w:rPr>
-          <w:iCs/>
-          <w:i/>
-        </w:rPr>
-        <w:t xml:space="preserve">Jesus (Yeshua)</w:t>
-      </w:r>
-      <w:r>
-        <w:t xml:space="preserve">?</w:t>
+        <w:t xml:space="preserve">”</w:t>
+      </w:r>
+      <w:r>
+        <w:t xml:space="preserve"> </w:t>
+      </w:r>
+      <w:r>
+        <w:t xml:space="preserve">or</w:t>
+      </w:r>
+      <w:r>
+        <w:t xml:space="preserve"> </w:t>
+      </w:r>
+      <w:r>
+        <w:t xml:space="preserve">“</w:t>
+      </w:r>
+      <w:r>
+        <w:t xml:space="preserve">Yeshu</w:t>
+      </w:r>
+      <w:r>
+        <w:t xml:space="preserve">”</w:t>
+      </w:r>
+      <w:r>
+        <w:t xml:space="preserve">.</w:t>
       </w:r>
     </w:p>
     <w:p>
@@ -2576,7 +2570,7 @@
         <w:t xml:space="preserve"> </w:t>
       </w:r>
       <w:r>
-        <w:t xml:space="preserve">baby Moses and Miriam at the Nile (Chapter 10), or the sea crossing (Chapter 13)?</w:t>
+        <w:t xml:space="preserve">baby Moses in the basket, with Miriam watching (Chapter 10).</w:t>
       </w:r>
     </w:p>
     <w:p>
@@ -2598,23 +2592,7 @@
         <w:t xml:space="preserve"> </w:t>
       </w:r>
       <w:r>
-        <w:t xml:space="preserve">for consistency with Book 1, Grandma, Joesiah and Malani should keep the same faces, hair and skin tones. Use</w:t>
-      </w:r>
-      <w:r>
-        <w:t xml:space="preserve"> </w:t>
-      </w:r>
-      <w:r>
-        <w:rPr>
-          <w:bCs/>
-          <w:b/>
-        </w:rPr>
-        <w:t xml:space="preserve">Book 1’s illustrations as the reference</w:t>
-      </w:r>
-      <w:r>
-        <w:t xml:space="preserve"> </w:t>
-      </w:r>
-      <w:r>
-        <w:t xml:space="preserve">for your illustrator.</w:t>
+        <w:t xml:space="preserve">Grandma, Joesiah and Malani keep their Book 1 look. Use Book 1’s illustrations as the reference.</w:t>
       </w:r>
     </w:p>
     <w:p>
@@ -2630,13 +2608,25 @@
           <w:bCs/>
           <w:b/>
         </w:rPr>
-        <w:t xml:space="preserve">Next step:</w:t>
-      </w:r>
-      <w:r>
-        <w:t xml:space="preserve"> </w:t>
-      </w:r>
-      <w:r>
-        <w:t xml:space="preserve">once you approve or change this outline, should I draft Chapter 1 in your Book 1 voice for you to edit, or will you write the chapters yourself?</w:t>
+        <w:t xml:space="preserve">Writing:</w:t>
+      </w:r>
+      <w:r>
+        <w:t xml:space="preserve"> </w:t>
+      </w:r>
+      <w:r>
+        <w:t xml:space="preserve">Claude drafts each chapter in the Book 1 voice; the author edits. Chapter 1 draft:</w:t>
+      </w:r>
+      <w:r>
+        <w:t xml:space="preserve"> </w:t>
+      </w:r>
+      <w:r>
+        <w:rPr>
+          <w:rStyle w:val="VerbatimChar"/>
+        </w:rPr>
+        <w:t xml:space="preserve">Chapter_01_Draft.md</w:t>
+      </w:r>
+      <w:r>
+        <w:t xml:space="preserve">.</w:t>
       </w:r>
     </w:p>
     <w:bookmarkEnd w:id="41"/>

</xml_diff>

<commit_message>
Book 2: record Yeshua spelling and Red Sea cover; add Chapter 2 draft
Co-Authored-By: Claude Opus 5.5 <noreply@anthropic.com>
Claude-Session: https://claude.ai/code/session_01MoWmDNVtH34VN9ywvoYJRo
</commit_message>
<xml_diff>
--- a/book2/Book2_Outline.docx
+++ b/book2/Book2_Outline.docx
@@ -1819,16 +1819,6 @@
       <w:r>
         <w:t xml:space="preserve">Miriam hiding in the reeds as the princess finds the basket.</w:t>
       </w:r>
-      <w:r>
-        <w:t xml:space="preserve"> </w:t>
-      </w:r>
-      <w:r>
-        <w:rPr>
-          <w:iCs/>
-          <w:i/>
-        </w:rPr>
-        <w:t xml:space="preserve">This could be the Book 2 cover scene.</w:t>
-      </w:r>
     </w:p>
     <w:bookmarkEnd w:id="34"/>
     <w:bookmarkEnd w:id="35"/>
@@ -2316,7 +2306,7 @@
           <w:iCs/>
           <w:i/>
         </w:rPr>
-        <w:t xml:space="preserve">Malani’s favorite page.</w:t>
+        <w:t xml:space="preserve">Malani’s favorite page. This is the Book 2 cover scene.</w:t>
       </w:r>
     </w:p>
     <w:bookmarkEnd w:id="38"/>
@@ -2515,39 +2505,19 @@
         <w:t xml:space="preserve"> </w:t>
       </w:r>
       <w:r>
-        <w:t xml:space="preserve">yes, Book 2’s last page previews the Yeshua book. Spelling to be confirmed:</w:t>
-      </w:r>
-      <w:r>
-        <w:t xml:space="preserve"> </w:t>
-      </w:r>
-      <w:r>
-        <w:t xml:space="preserve">“</w:t>
-      </w:r>
-      <w:r>
+        <w:t xml:space="preserve">yes, Book 2’s last page previews the Yeshua book. Spelling:</w:t>
+      </w:r>
+      <w:r>
+        <w:t xml:space="preserve"> </w:t>
+      </w:r>
+      <w:r>
+        <w:rPr>
+          <w:bCs/>
+          <w:b/>
+        </w:rPr>
         <w:t xml:space="preserve">Yeshua</w:t>
       </w:r>
       <w:r>
-        <w:t xml:space="preserve">”</w:t>
-      </w:r>
-      <w:r>
-        <w:t xml:space="preserve"> </w:t>
-      </w:r>
-      <w:r>
-        <w:t xml:space="preserve">or</w:t>
-      </w:r>
-      <w:r>
-        <w:t xml:space="preserve"> </w:t>
-      </w:r>
-      <w:r>
-        <w:t xml:space="preserve">“</w:t>
-      </w:r>
-      <w:r>
-        <w:t xml:space="preserve">Yeshu</w:t>
-      </w:r>
-      <w:r>
-        <w:t xml:space="preserve">”</w:t>
-      </w:r>
-      <w:r>
         <w:t xml:space="preserve">.</w:t>
       </w:r>
     </w:p>
@@ -2570,7 +2540,23 @@
         <w:t xml:space="preserve"> </w:t>
       </w:r>
       <w:r>
-        <w:t xml:space="preserve">baby Moses in the basket, with Miriam watching (Chapter 10).</w:t>
+        <w:t xml:space="preserve">the</w:t>
+      </w:r>
+      <w:r>
+        <w:t xml:space="preserve"> </w:t>
+      </w:r>
+      <w:r>
+        <w:rPr>
+          <w:bCs/>
+          <w:b/>
+        </w:rPr>
+        <w:t xml:space="preserve">Red Sea crossing</w:t>
+      </w:r>
+      <w:r>
+        <w:t xml:space="preserve"> </w:t>
+      </w:r>
+      <w:r>
+        <w:t xml:space="preserve">(Chapter 13).</w:t>
       </w:r>
     </w:p>
     <w:p>
@@ -2614,7 +2600,7 @@
         <w:t xml:space="preserve"> </w:t>
       </w:r>
       <w:r>
-        <w:t xml:space="preserve">Claude drafts each chapter in the Book 1 voice; the author edits. Chapter 1 draft:</w:t>
+        <w:t xml:space="preserve">Claude drafts each chapter in the Book 1 voice; the author edits. Drafts:</w:t>
       </w:r>
       <w:r>
         <w:t xml:space="preserve"> </w:t>
@@ -2624,6 +2610,21 @@
           <w:rStyle w:val="VerbatimChar"/>
         </w:rPr>
         <w:t xml:space="preserve">Chapter_01_Draft.md</w:t>
+      </w:r>
+      <w:r>
+        <w:t xml:space="preserve"> </w:t>
+      </w:r>
+      <w:r>
+        <w:t xml:space="preserve">(approved),</w:t>
+      </w:r>
+      <w:r>
+        <w:t xml:space="preserve"> </w:t>
+      </w:r>
+      <w:r>
+        <w:rPr>
+          <w:rStyle w:val="VerbatimChar"/>
+        </w:rPr>
+        <w:t xml:space="preserve">Chapter_02_Draft.md</w:t>
       </w:r>
       <w:r>
         <w:t xml:space="preserve">.</w:t>

</xml_diff>

<commit_message>
Book 2: add Chapter 3 and 4 drafts (Abraham's covenant, Hagar)
Co-Authored-By: Claude Opus 5.5 <noreply@anthropic.com>
Claude-Session: https://claude.ai/code/session_01MoWmDNVtH34VN9ywvoYJRo
</commit_message>
<xml_diff>
--- a/book2/Book2_Outline.docx
+++ b/book2/Book2_Outline.docx
@@ -2615,6 +2615,21 @@
         <w:t xml:space="preserve"> </w:t>
       </w:r>
       <w:r>
+        <w:t xml:space="preserve">and</w:t>
+      </w:r>
+      <w:r>
+        <w:t xml:space="preserve"> </w:t>
+      </w:r>
+      <w:r>
+        <w:rPr>
+          <w:rStyle w:val="VerbatimChar"/>
+        </w:rPr>
+        <w:t xml:space="preserve">Chapter_02_Draft.md</w:t>
+      </w:r>
+      <w:r>
+        <w:t xml:space="preserve"> </w:t>
+      </w:r>
+      <w:r>
         <w:t xml:space="preserve">(approved),</w:t>
       </w:r>
       <w:r>
@@ -2624,7 +2639,19 @@
         <w:rPr>
           <w:rStyle w:val="VerbatimChar"/>
         </w:rPr>
-        <w:t xml:space="preserve">Chapter_02_Draft.md</w:t>
+        <w:t xml:space="preserve">Chapter_03_Draft.md</w:t>
+      </w:r>
+      <w:r>
+        <w:t xml:space="preserve">,</w:t>
+      </w:r>
+      <w:r>
+        <w:t xml:space="preserve"> </w:t>
+      </w:r>
+      <w:r>
+        <w:rPr>
+          <w:rStyle w:val="VerbatimChar"/>
+        </w:rPr>
+        <w:t xml:space="preserve">Chapter_04_Draft.md</w:t>
       </w:r>
       <w:r>
         <w:t xml:space="preserve">.</w:t>

</xml_diff>

<commit_message>
Book 2: add Chapter 5 and 6 drafts (Isaac, Rebekah and the twins)
Co-Authored-By: Claude Opus 5.5 <noreply@anthropic.com>
Claude-Session: https://claude.ai/code/session_01MoWmDNVtH34VN9ywvoYJRo
</commit_message>
<xml_diff>
--- a/book2/Book2_Outline.docx
+++ b/book2/Book2_Outline.docx
@@ -2642,7 +2642,10 @@
         <w:t xml:space="preserve">Chapter_03_Draft.md</w:t>
       </w:r>
       <w:r>
-        <w:t xml:space="preserve">,</w:t>
+        <w:t xml:space="preserve"> </w:t>
+      </w:r>
+      <w:r>
+        <w:t xml:space="preserve">to</w:t>
       </w:r>
       <w:r>
         <w:t xml:space="preserve"> </w:t>
@@ -2651,7 +2654,7 @@
         <w:rPr>
           <w:rStyle w:val="VerbatimChar"/>
         </w:rPr>
-        <w:t xml:space="preserve">Chapter_04_Draft.md</w:t>
+        <w:t xml:space="preserve">Chapter_06_Draft.md</w:t>
       </w:r>
       <w:r>
         <w:t xml:space="preserve">.</w:t>

</xml_diff>

<commit_message>
Book 2: finish first draft (Chapters 11-14), add midwives line to Ch 9
Adds the Burning Bush, the plagues and Passover, the Red Sea crossing,
and Sinai with the Book 3 (Yeshua) teaser, plus a combined full-draft
manuscript.

Co-Authored-By: Claude Opus 5.5 <noreply@anthropic.com>
Claude-Session: https://claude.ai/code/session_01MoWmDNVtH34VN9ywvoYJRo
</commit_message>
<xml_diff>
--- a/book2/Book2_Outline.docx
+++ b/book2/Book2_Outline.docx
@@ -2654,7 +2654,22 @@
         <w:rPr>
           <w:rStyle w:val="VerbatimChar"/>
         </w:rPr>
-        <w:t xml:space="preserve">Chapter_10_Draft.md</w:t>
+        <w:t xml:space="preserve">Chapter_14_Draft.md</w:t>
+      </w:r>
+      <w:r>
+        <w:t xml:space="preserve"> </w:t>
+      </w:r>
+      <w:r>
+        <w:t xml:space="preserve">(all 14 drafted). Full manuscript:</w:t>
+      </w:r>
+      <w:r>
+        <w:t xml:space="preserve"> </w:t>
+      </w:r>
+      <w:r>
+        <w:rPr>
+          <w:rStyle w:val="VerbatimChar"/>
+        </w:rPr>
+        <w:t xml:space="preserve">Book2_Full_Draft.md</w:t>
       </w:r>
       <w:r>
         <w:t xml:space="preserve">.</w:t>

</xml_diff>